<commit_message>
Update referees in application package for Wasswa Wilson
- Added Racheal Nabukeera as a new referee in `build_agromavericks_application.py`, `Wasswa_Wilson_CV_AgroMavericks.docx`, and `Wasswa_Wilson_CV_AgroMavericks.pdf`, replacing Dr. Mamello Muhanuuzi to reflect current references.
- Ensured consistency across all application documents for clarity and completeness.
</commit_message>
<xml_diff>
--- a/agromavericks/application/Wasswa_Wilson_CV_AgroMavericks.docx
+++ b/agromavericks/application/Wasswa_Wilson_CV_AgroMavericks.docx
@@ -861,6 +861,18 @@
           <w:rFonts w:ascii="Calibri" w:hAnsi="Calibri"/>
           <w:sz w:val="21"/>
         </w:rPr>
+        <w:t>Racheal Nabukeera - Director and Founder, FairBanks Medical Centre - nracheal017@gmail.com / +256 772 849 258</w:t>
+      </w:r>
+    </w:p>
+    <w:p>
+      <w:pPr>
+        <w:spacing w:after="40" w:before="0"/>
+      </w:pPr>
+      <w:r>
+        <w:rPr>
+          <w:rFonts w:ascii="Calibri" w:hAnsi="Calibri"/>
+          <w:sz w:val="21"/>
+        </w:rPr>
         <w:t>Eng. Richard Ssejongo - Biomedical Engineer, St. Francis Hospital Nsambya - +256 753 818 754 / +256 777 132 489</w:t>
       </w:r>
     </w:p>
@@ -874,18 +886,6 @@
           <w:sz w:val="21"/>
         </w:rPr>
         <w:t>Dr. Annet Khingi - Senior Radiologist and Administrator, Mengo Hospital - +256 772 592 771 / +256 701 592 771</w:t>
-      </w:r>
-    </w:p>
-    <w:p>
-      <w:pPr>
-        <w:spacing w:after="40" w:before="0"/>
-      </w:pPr>
-      <w:r>
-        <w:rPr>
-          <w:rFonts w:ascii="Calibri" w:hAnsi="Calibri"/>
-          <w:sz w:val="21"/>
-        </w:rPr>
-        <w:t>Dr. Mamello Muhanuuzi - Former Medical Director, International Hospital Kampala - +256 702 811 008</w:t>
       </w:r>
     </w:p>
     <w:sectPr>

</xml_diff>

<commit_message>
Enhance application materials with detailed AI reception agent project description
- Updated `build_agromavericks_application.py`, `application_answers.md`, and various document formats to include a comprehensive overview of the AI reception agent developed for a law firm in Texas, highlighting its functionalities such as call handling, appointment management, and client follow-ups.
- Revised professional summaries and project descriptions across multiple documents to reflect the active use and impact of the AI agent, ensuring clarity and consistency in the application materials.
</commit_message>
<xml_diff>
--- a/agromavericks/application/Wasswa_Wilson_CV_AgroMavericks.docx
+++ b/agromavericks/application/Wasswa_Wilson_CV_AgroMavericks.docx
@@ -84,7 +84,7 @@
           <w:rFonts w:ascii="Calibri" w:hAnsi="Calibri"/>
           <w:sz w:val="21"/>
         </w:rPr>
-        <w:t>I am a full-stack developer based in Kampala. I build web and mobile apps, and I have worked with the main tools listed in this job: Next.js, TypeScript, Tailwind CSS, React Native and Expo, Convex, Better Auth, Resend, WhatsApp messaging, Bunny.net, Vercel, and EAS. I also use Node.js, SQL databases, Prisma, JWT and role-based access, testing tools, and CI/CD. On top of that I have solid experience with Java, PHP, MySQL, Azure, and AWS. Right now I lead software work at FairBanks Medical Centre on FCHIP and hospital systems. Before that I built school and clinic software, and I also spent several years managing biomedical programmes in hospitals.</w:t>
+        <w:t>I am a full-stack developer based in Kampala. I build web and mobile apps, and I have worked with the main tools listed in this job: Next.js, TypeScript, Tailwind CSS, React Native and Expo, Convex, Better Auth, Resend, WhatsApp messaging, Bunny.net, Vercel, and EAS. I also use Node.js, SQL databases, Prisma, JWT and role-based access, testing tools, and CI/CD. On top of that I have solid experience with Java, PHP, MySQL, Azure, and AWS. Right now I lead software work at FairBanks Medical Centre on FCHIP and hospital systems. I have also built and deployed an AI reception agent for a law firm in Texas that answers calls, manages appointments, and follows up with clients. Before that I built school and clinic software, and I also spent several years managing biomedical programmes in hospitals.</w:t>
       </w:r>
     </w:p>
     <w:p>
@@ -268,20 +268,6 @@
     </w:p>
     <w:p>
       <w:pPr>
-        <w:pStyle w:val="ListBullet"/>
-        <w:spacing w:after="40" w:before="0"/>
-        <w:ind w:left="288"/>
-      </w:pPr>
-      <w:r>
-        <w:rPr>
-          <w:rFonts w:ascii="Calibri" w:hAnsi="Calibri"/>
-          <w:sz w:val="20"/>
-        </w:rPr>
-        <w:t>Built and deployed a working AI agent for a law firm in Texas that is in active use.</w:t>
-      </w:r>
-    </w:p>
-    <w:p>
-      <w:pPr>
         <w:spacing w:before="200" w:after="80"/>
         <w:pBdr>
           <w:bottom w:val="single" w:sz="12" w:space="1" w:color="1A6B5C"/>
@@ -295,6 +281,75 @@
           <w:sz w:val="22"/>
         </w:rPr>
         <w:t>SOFTWARE PROJECTS</w:t>
+      </w:r>
+    </w:p>
+    <w:p>
+      <w:pPr>
+        <w:spacing w:before="120" w:after="20"/>
+      </w:pPr>
+      <w:r>
+        <w:rPr>
+          <w:rFonts w:ascii="Calibri" w:hAnsi="Calibri"/>
+          <w:b/>
+          <w:color w:val="222222"/>
+          <w:sz w:val="21"/>
+        </w:rPr>
+        <w:t>AI reception agent (law firm, Texas, USA)</w:t>
+      </w:r>
+    </w:p>
+    <w:p>
+      <w:pPr>
+        <w:spacing w:before="0" w:after="40"/>
+      </w:pPr>
+      <w:r>
+        <w:rPr>
+          <w:i/>
+          <w:color w:val="555555"/>
+          <w:sz w:val="19"/>
+        </w:rPr>
+        <w:t>Built and deployed; in active use</w:t>
+      </w:r>
+    </w:p>
+    <w:p>
+      <w:pPr>
+        <w:pStyle w:val="ListBullet"/>
+        <w:spacing w:after="40" w:before="0"/>
+        <w:ind w:left="288"/>
+      </w:pPr>
+      <w:r>
+        <w:rPr>
+          <w:rFonts w:ascii="Calibri" w:hAnsi="Calibri"/>
+          <w:sz w:val="20"/>
+        </w:rPr>
+        <w:t>Built and deployed an AI reception agent for a law firm in Texas that handles incoming client calls in live use.</w:t>
+      </w:r>
+    </w:p>
+    <w:p>
+      <w:pPr>
+        <w:pStyle w:val="ListBullet"/>
+        <w:spacing w:after="40" w:before="0"/>
+        <w:ind w:left="288"/>
+      </w:pPr>
+      <w:r>
+        <w:rPr>
+          <w:rFonts w:ascii="Calibri" w:hAnsi="Calibri"/>
+          <w:sz w:val="20"/>
+        </w:rPr>
+        <w:t>The agent manages appointments (book, reschedule, and related scheduling) so staff spend less time on the phone.</w:t>
+      </w:r>
+    </w:p>
+    <w:p>
+      <w:pPr>
+        <w:pStyle w:val="ListBullet"/>
+        <w:spacing w:after="40" w:before="0"/>
+        <w:ind w:left="288"/>
+      </w:pPr>
+      <w:r>
+        <w:rPr>
+          <w:rFonts w:ascii="Calibri" w:hAnsi="Calibri"/>
+          <w:sz w:val="20"/>
+        </w:rPr>
+        <w:t>It also follows up with clients after contact, helping the firm stay on top of leads and ongoing matters.</w:t>
       </w:r>
     </w:p>
     <w:p>

</xml_diff>